<commit_message>
Itinerary: keep Menton on 4/24, add Antibes to 4/21 drive
Co-Authored-By: Claude Opus 5.5 <noreply@anthropic.com>
Claude-Session: https://claude.ai/code/session_01LP6txd659MQKeQ6w31agxv
</commit_message>
<xml_diff>
--- a/2027瑞法義16天行程_修正定案版.docx
+++ b/2027瑞法義16天行程_修正定案版.docx
@@ -313,7 +313,23 @@
           <w:b w:val="false"/>
           <w:bCs w:val="false"/>
         </w:rPr>
-        <w:t xml:space="preserve">：順路去 Saint-Paul-de-Vence ＋ Fondation Maeght，再到機場還車。</w:t>
+        <w:t xml:space="preserve">：開車順路去 </w:t>
+      </w:r>
+      <w:r>
+        <w:rPr>
+          <w:rFonts w:ascii="Arial" w:cs="Arial" w:eastAsia="Microsoft JhengHei" w:hAnsi="Arial"/>
+          <w:b/>
+          <w:bCs/>
+        </w:rPr>
+        <w:t xml:space="preserve">Antibes</w:t>
+      </w:r>
+      <w:r>
+        <w:rPr>
+          <w:rFonts w:ascii="Arial" w:cs="Arial" w:eastAsia="Microsoft JhengHei" w:hAnsi="Arial"/>
+          <w:b w:val="false"/>
+          <w:bCs w:val="false"/>
+        </w:rPr>
+        <w:t xml:space="preserve">（Picasso 美術館、週三上午市集、老城）與 Saint-Paul-de-Vence，再到機場還車。</w:t>
       </w:r>
     </w:p>
     <w:p>
@@ -415,23 +431,7 @@
           <w:b w:val="false"/>
           <w:bCs w:val="false"/>
         </w:rPr>
-        <w:t xml:space="preserve">：芒通改為 </w:t>
-      </w:r>
-      <w:r>
-        <w:rPr>
-          <w:rFonts w:ascii="Arial" w:cs="Arial" w:eastAsia="Microsoft JhengHei" w:hAnsi="Arial"/>
-          <w:b/>
-          <w:bCs/>
-        </w:rPr>
-        <w:t xml:space="preserve">Antibes</w:t>
-      </w:r>
-      <w:r>
-        <w:rPr>
-          <w:rFonts w:ascii="Arial" w:cs="Arial" w:eastAsia="Microsoft JhengHei" w:hAnsi="Arial"/>
-          <w:b w:val="false"/>
-          <w:bCs w:val="false"/>
-        </w:rPr>
-        <w:t xml:space="preserve">（摩納哥看完後同一條沿海線火車直達，不用換車）。</w:t>
+        <w:t xml:space="preserve">：維持摩納哥 ＋ 芒通。</w:t>
       </w:r>
     </w:p>
     <w:p>
@@ -567,7 +567,7 @@
           <w:b w:val="false"/>
           <w:bCs w:val="false"/>
         </w:rPr>
-        <w:t xml:space="preserve">：里昂過夜、Sénanque、芒通、Zum See 午餐、Cimiez 羅馬遺址、4/20 Spa 主行程、4/19 咖啡空檔。</w:t>
+        <w:t xml:space="preserve">：里昂過夜、Sénanque、Zum See 午餐、Cimiez 羅馬遺址、4/20 Spa 主行程、4/19 咖啡空檔。</w:t>
       </w:r>
     </w:p>
     <w:p>
@@ -1897,7 +1897,7 @@
                 <w:sz w:val="19"/>
                 <w:szCs w:val="19"/>
               </w:rPr>
-              <w:t xml:space="preserve">Saint-Paul-de-Vence ＋ Maeght → 機場還車 → 散步道</w:t>
+              <w:t xml:space="preserve">Antibes（Picasso、市集、老城）→ Saint-Paul-de-Vence → 機場還車</w:t>
             </w:r>
           </w:p>
         </w:tc>
@@ -1929,7 +1929,7 @@
                 <w:sz w:val="19"/>
                 <w:szCs w:val="19"/>
               </w:rPr>
-              <w:t xml:space="preserve">中</w:t>
+              <w:t xml:space="preserve">中偏滿</w:t>
             </w:r>
           </w:p>
         </w:tc>
@@ -2296,7 +2296,7 @@
                 <w:sz w:val="19"/>
                 <w:szCs w:val="19"/>
               </w:rPr>
-              <w:t xml:space="preserve">摩納哥 → Antibes（Picasso、老城、城牆）</w:t>
+              <w:t xml:space="preserve">摩納哥（賭場、衛兵交接）→ 芒通</w:t>
             </w:r>
           </w:p>
         </w:tc>
@@ -2328,7 +2328,7 @@
                 <w:sz w:val="19"/>
                 <w:szCs w:val="19"/>
               </w:rPr>
-              <w:t xml:space="preserve">中偏滿</w:t>
+              <w:t xml:space="preserve">中</w:t>
             </w:r>
           </w:p>
         </w:tc>
@@ -5488,7 +5488,7 @@
                 <w:sz w:val="19"/>
                 <w:szCs w:val="19"/>
               </w:rPr>
-              <w:t xml:space="preserve">尼斯 → 摩納哥 → Antibes → 尼斯</w:t>
+              <w:t xml:space="preserve">尼斯 → 摩納哥 → 芒通 → 尼斯</w:t>
             </w:r>
           </w:p>
         </w:tc>
@@ -5552,7 +5552,7 @@
                 <w:sz w:val="19"/>
                 <w:szCs w:val="19"/>
               </w:rPr>
-              <w:t xml:space="preserve">25 分 ＋ 約 50 分 ＋ 約 25 分</w:t>
+              <w:t xml:space="preserve">25 分 ＋ 約 15 分 ＋ 約 35 分</w:t>
             </w:r>
           </w:p>
         </w:tc>
@@ -5584,7 +5584,7 @@
                 <w:sz w:val="19"/>
                 <w:szCs w:val="19"/>
               </w:rPr>
-              <w:t xml:space="preserve">前一晚查班次</w:t>
+              <w:t xml:space="preserve">前一晚存好回程兩班</w:t>
             </w:r>
           </w:p>
         </w:tc>
@@ -12572,7 +12572,7 @@
         <w:rPr>
           <w:rFonts w:ascii="Arial" w:cs="Arial" w:eastAsia="Microsoft JhengHei" w:hAnsi="Arial"/>
         </w:rPr>
-        <w:t xml:space="preserve">4/21（三）Fonscolombe → Saint-Paul-de-Vence → 尼斯</w:t>
+        <w:t xml:space="preserve">4/21（三）Fonscolombe → Antibes → Saint-Paul-de-Vence → 尼斯</w:t>
       </w:r>
     </w:p>
     <w:p>
@@ -12709,7 +12709,7 @@
                 <w:sz w:val="19"/>
                 <w:szCs w:val="19"/>
               </w:rPr>
-              <w:t xml:space="preserve">08:15–09:00</w:t>
+              <w:t xml:space="preserve">07:30–08:15</w:t>
             </w:r>
           </w:p>
         </w:tc>
@@ -12778,7 +12778,7 @@
                 <w:sz w:val="19"/>
                 <w:szCs w:val="19"/>
               </w:rPr>
-              <w:t xml:space="preserve">09:15</w:t>
+              <w:t xml:space="preserve">08:30</w:t>
             </w:r>
           </w:p>
         </w:tc>
@@ -12847,7 +12847,7 @@
                 <w:sz w:val="19"/>
                 <w:szCs w:val="19"/>
               </w:rPr>
-              <w:t xml:space="preserve">約 11:15</w:t>
+              <w:t xml:space="preserve">約 10:15</w:t>
             </w:r>
           </w:p>
         </w:tc>
@@ -12879,7 +12879,7 @@
                 <w:sz w:val="19"/>
                 <w:szCs w:val="19"/>
               </w:rPr>
-              <w:t xml:space="preserve">抵達 Saint-Paul-de-Vence，停村口 </w:t>
+              <w:t xml:space="preserve">抵達 </w:t>
             </w:r>
             <w:r>
               <w:rPr>
@@ -12889,17 +12889,17 @@
                 <w:sz w:val="19"/>
                 <w:szCs w:val="19"/>
               </w:rPr>
-              <w:t xml:space="preserve">Indigo 地下停車場</w:t>
-            </w:r>
-            <w:r>
-              <w:rPr>
-                <w:rFonts w:ascii="Arial" w:cs="Arial" w:eastAsia="Microsoft JhengHei" w:hAnsi="Arial"/>
-                <w:b w:val="false"/>
-                <w:bCs w:val="false"/>
-                <w:sz w:val="19"/>
-                <w:szCs w:val="19"/>
-              </w:rPr>
-              <w:t xml:space="preserve">（限高 1.90m，只收硬幣）</w:t>
+              <w:t xml:space="preserve">Antibes</w:t>
+            </w:r>
+            <w:r>
+              <w:rPr>
+                <w:rFonts w:ascii="Arial" w:cs="Arial" w:eastAsia="Microsoft JhengHei" w:hAnsi="Arial"/>
+                <w:b w:val="false"/>
+                <w:bCs w:val="false"/>
+                <w:sz w:val="19"/>
+                <w:szCs w:val="19"/>
+              </w:rPr>
+              <w:t xml:space="preserve">，停港邊 Q-Park Pré-aux-Pêcheurs 地下停車場（600 位，步行到老城約 5 分；⚠ 確認限高）</w:t>
             </w:r>
           </w:p>
         </w:tc>
@@ -12936,7 +12936,7 @@
                 <w:sz w:val="19"/>
                 <w:szCs w:val="19"/>
               </w:rPr>
-              <w:t xml:space="preserve">11:15–12:30</w:t>
+              <w:t xml:space="preserve">10:20–11:30</w:t>
             </w:r>
           </w:p>
         </w:tc>
@@ -12968,7 +12968,27 @@
                 <w:sz w:val="19"/>
                 <w:szCs w:val="19"/>
               </w:rPr>
-              <w:t xml:space="preserve">Fondation Maeght（每天 10:00–18:00；在村外約 1 公里，步行約 15 分鐘）</w:t>
+              <w:t xml:space="preserve"/>
+            </w:r>
+            <w:r>
+              <w:rPr>
+                <w:rFonts w:ascii="Arial" w:cs="Arial" w:eastAsia="Microsoft JhengHei" w:hAnsi="Arial"/>
+                <w:b/>
+                <w:bCs/>
+                <w:sz w:val="19"/>
+                <w:szCs w:val="19"/>
+              </w:rPr>
+              <w:t xml:space="preserve">Musée Picasso</w:t>
+            </w:r>
+            <w:r>
+              <w:rPr>
+                <w:rFonts w:ascii="Arial" w:cs="Arial" w:eastAsia="Microsoft JhengHei" w:hAnsi="Arial"/>
+                <w:b w:val="false"/>
+                <w:bCs w:val="false"/>
+                <w:sz w:val="19"/>
+                <w:szCs w:val="19"/>
+              </w:rPr>
+              <w:t xml:space="preserve">（Château Grimaldi；週一休；4 月上午 10:00–12:00、下午 14:00–18:00；約 €6）</w:t>
             </w:r>
           </w:p>
         </w:tc>
@@ -13005,7 +13025,7 @@
                 <w:sz w:val="19"/>
                 <w:szCs w:val="19"/>
               </w:rPr>
-              <w:t xml:space="preserve">12:45–14:00</w:t>
+              <w:t xml:space="preserve">11:30–12:30</w:t>
             </w:r>
           </w:p>
         </w:tc>
@@ -13037,7 +13057,27 @@
                 <w:sz w:val="19"/>
                 <w:szCs w:val="19"/>
               </w:rPr>
-              <w:t xml:space="preserve">午餐（想吃 La Colombe d'Or 要數月前訂位）</w:t>
+              <w:t xml:space="preserve"/>
+            </w:r>
+            <w:r>
+              <w:rPr>
+                <w:rFonts w:ascii="Arial" w:cs="Arial" w:eastAsia="Microsoft JhengHei" w:hAnsi="Arial"/>
+                <w:b/>
+                <w:bCs/>
+                <w:sz w:val="19"/>
+                <w:szCs w:val="19"/>
+              </w:rPr>
+              <w:t xml:space="preserve">Marché Provençal</w:t>
+            </w:r>
+            <w:r>
+              <w:rPr>
+                <w:rFonts w:ascii="Arial" w:cs="Arial" w:eastAsia="Microsoft JhengHei" w:hAnsi="Arial"/>
+                <w:b w:val="false"/>
+                <w:bCs w:val="false"/>
+                <w:sz w:val="19"/>
+                <w:szCs w:val="19"/>
+              </w:rPr>
+              <w:t xml:space="preserve">（Cours Masséna 有頂市集；9–5 月週二至週日 06:00–13:00）＋ 老城</w:t>
             </w:r>
           </w:p>
         </w:tc>
@@ -13074,7 +13114,7 @@
                 <w:sz w:val="19"/>
                 <w:szCs w:val="19"/>
               </w:rPr>
-              <w:t xml:space="preserve">14:00–15:00</w:t>
+              <w:t xml:space="preserve">12:30–13:30</w:t>
             </w:r>
           </w:p>
         </w:tc>
@@ -13106,7 +13146,7 @@
                 <w:sz w:val="19"/>
                 <w:szCs w:val="19"/>
               </w:rPr>
-              <w:t xml:space="preserve">山城散步</w:t>
+              <w:t xml:space="preserve">老城午餐</w:t>
             </w:r>
           </w:p>
         </w:tc>
@@ -13143,7 +13183,7 @@
                 <w:sz w:val="19"/>
                 <w:szCs w:val="19"/>
               </w:rPr>
-              <w:t xml:space="preserve">15:00–15:30</w:t>
+              <w:t xml:space="preserve">13:30–14:00</w:t>
             </w:r>
           </w:p>
         </w:tc>
@@ -13175,7 +13215,7 @@
                 <w:sz w:val="19"/>
                 <w:szCs w:val="19"/>
               </w:rPr>
-              <w:t xml:space="preserve">開往 NCE T2，加油後還車（拍車況）</w:t>
+              <w:t xml:space="preserve">Vauban 城牆海濱步道、Port Vauban 遊艇港</w:t>
             </w:r>
           </w:p>
         </w:tc>
@@ -13212,7 +13252,7 @@
                 <w:sz w:val="19"/>
                 <w:szCs w:val="19"/>
               </w:rPr>
-              <w:t xml:space="preserve">15:30–16:30</w:t>
+              <w:t xml:space="preserve">14:00–14:30</w:t>
             </w:r>
           </w:p>
         </w:tc>
@@ -13244,7 +13284,27 @@
                 <w:sz w:val="19"/>
                 <w:szCs w:val="19"/>
               </w:rPr>
-              <w:t xml:space="preserve">計程車兩台或一台廂型計程車進市區</w:t>
+              <w:t xml:space="preserve">開往 Saint-Paul-de-Vence（約 25 分），停村口 </w:t>
+            </w:r>
+            <w:r>
+              <w:rPr>
+                <w:rFonts w:ascii="Arial" w:cs="Arial" w:eastAsia="Microsoft JhengHei" w:hAnsi="Arial"/>
+                <w:b/>
+                <w:bCs/>
+                <w:sz w:val="19"/>
+                <w:szCs w:val="19"/>
+              </w:rPr>
+              <w:t xml:space="preserve">Indigo 地下停車場</w:t>
+            </w:r>
+            <w:r>
+              <w:rPr>
+                <w:rFonts w:ascii="Arial" w:cs="Arial" w:eastAsia="Microsoft JhengHei" w:hAnsi="Arial"/>
+                <w:b w:val="false"/>
+                <w:bCs w:val="false"/>
+                <w:sz w:val="19"/>
+                <w:szCs w:val="19"/>
+              </w:rPr>
+              <w:t xml:space="preserve">（限高 1.90m，只收硬幣）</w:t>
             </w:r>
           </w:p>
         </w:tc>
@@ -13281,7 +13341,7 @@
                 <w:sz w:val="19"/>
                 <w:szCs w:val="19"/>
               </w:rPr>
-              <w:t xml:space="preserve">16:30–19:30</w:t>
+              <w:t xml:space="preserve">14:30–16:15</w:t>
             </w:r>
           </w:p>
         </w:tc>
@@ -13313,7 +13373,145 @@
                 <w:sz w:val="19"/>
                 <w:szCs w:val="19"/>
               </w:rPr>
-              <w:t xml:space="preserve">入住、休息</w:t>
+              <w:t xml:space="preserve">Saint-Paul-de-Vence 山城散步；Fondation Maeght 為選配（每天 10:00–18:00，村外約 1 公里）</w:t>
+            </w:r>
+          </w:p>
+        </w:tc>
+      </w:tr>
+      <w:tr>
+        <w:trPr>
+          <w:cantSplit/>
+        </w:trPr>
+        <w:tc>
+          <w:tcPr>
+            <w:tcW w:type="dxa" w:w="1700"/>
+            <w:tcBorders>
+              <w:top w:val="single" w:color="BFBFBF" w:sz="4"/>
+              <w:left w:val="single" w:color="BFBFBF" w:sz="4"/>
+              <w:bottom w:val="single" w:color="BFBFBF" w:sz="4"/>
+              <w:right w:val="single" w:color="BFBFBF" w:sz="4"/>
+            </w:tcBorders>
+            <w:tcMar>
+              <w:top w:type="dxa" w:w="60"/>
+              <w:left w:type="dxa" w:w="100"/>
+              <w:bottom w:type="dxa" w:w="60"/>
+              <w:right w:type="dxa" w:w="100"/>
+            </w:tcMar>
+          </w:tcPr>
+          <w:p>
+            <w:pPr>
+              <w:spacing w:after="0" w:line="270"/>
+            </w:pPr>
+            <w:r>
+              <w:rPr>
+                <w:rFonts w:ascii="Arial" w:cs="Arial" w:eastAsia="Microsoft JhengHei" w:hAnsi="Arial"/>
+                <w:b w:val="false"/>
+                <w:bCs w:val="false"/>
+                <w:sz w:val="19"/>
+                <w:szCs w:val="19"/>
+              </w:rPr>
+              <w:t xml:space="preserve">16:15–16:45</w:t>
+            </w:r>
+          </w:p>
+        </w:tc>
+        <w:tc>
+          <w:tcPr>
+            <w:tcW w:type="dxa" w:w="8206"/>
+            <w:tcBorders>
+              <w:top w:val="single" w:color="BFBFBF" w:sz="4"/>
+              <w:left w:val="single" w:color="BFBFBF" w:sz="4"/>
+              <w:bottom w:val="single" w:color="BFBFBF" w:sz="4"/>
+              <w:right w:val="single" w:color="BFBFBF" w:sz="4"/>
+            </w:tcBorders>
+            <w:tcMar>
+              <w:top w:type="dxa" w:w="60"/>
+              <w:left w:type="dxa" w:w="100"/>
+              <w:bottom w:type="dxa" w:w="60"/>
+              <w:right w:type="dxa" w:w="100"/>
+            </w:tcMar>
+          </w:tcPr>
+          <w:p>
+            <w:pPr>
+              <w:spacing w:after="0" w:line="270"/>
+            </w:pPr>
+            <w:r>
+              <w:rPr>
+                <w:rFonts w:ascii="Arial" w:cs="Arial" w:eastAsia="Microsoft JhengHei" w:hAnsi="Arial"/>
+                <w:b w:val="false"/>
+                <w:bCs w:val="false"/>
+                <w:sz w:val="19"/>
+                <w:szCs w:val="19"/>
+              </w:rPr>
+              <w:t xml:space="preserve">開往 NCE T2，加油後還車（拍車況）</w:t>
+            </w:r>
+          </w:p>
+        </w:tc>
+      </w:tr>
+      <w:tr>
+        <w:trPr>
+          <w:cantSplit/>
+        </w:trPr>
+        <w:tc>
+          <w:tcPr>
+            <w:tcW w:type="dxa" w:w="1700"/>
+            <w:tcBorders>
+              <w:top w:val="single" w:color="BFBFBF" w:sz="4"/>
+              <w:left w:val="single" w:color="BFBFBF" w:sz="4"/>
+              <w:bottom w:val="single" w:color="BFBFBF" w:sz="4"/>
+              <w:right w:val="single" w:color="BFBFBF" w:sz="4"/>
+            </w:tcBorders>
+            <w:tcMar>
+              <w:top w:type="dxa" w:w="60"/>
+              <w:left w:type="dxa" w:w="100"/>
+              <w:bottom w:type="dxa" w:w="60"/>
+              <w:right w:type="dxa" w:w="100"/>
+            </w:tcMar>
+          </w:tcPr>
+          <w:p>
+            <w:pPr>
+              <w:spacing w:after="0" w:line="270"/>
+            </w:pPr>
+            <w:r>
+              <w:rPr>
+                <w:rFonts w:ascii="Arial" w:cs="Arial" w:eastAsia="Microsoft JhengHei" w:hAnsi="Arial"/>
+                <w:b w:val="false"/>
+                <w:bCs w:val="false"/>
+                <w:sz w:val="19"/>
+                <w:szCs w:val="19"/>
+              </w:rPr>
+              <w:t xml:space="preserve">16:45–17:45</w:t>
+            </w:r>
+          </w:p>
+        </w:tc>
+        <w:tc>
+          <w:tcPr>
+            <w:tcW w:type="dxa" w:w="8206"/>
+            <w:tcBorders>
+              <w:top w:val="single" w:color="BFBFBF" w:sz="4"/>
+              <w:left w:val="single" w:color="BFBFBF" w:sz="4"/>
+              <w:bottom w:val="single" w:color="BFBFBF" w:sz="4"/>
+              <w:right w:val="single" w:color="BFBFBF" w:sz="4"/>
+            </w:tcBorders>
+            <w:tcMar>
+              <w:top w:type="dxa" w:w="60"/>
+              <w:left w:type="dxa" w:w="100"/>
+              <w:bottom w:type="dxa" w:w="60"/>
+              <w:right w:type="dxa" w:w="100"/>
+            </w:tcMar>
+          </w:tcPr>
+          <w:p>
+            <w:pPr>
+              <w:spacing w:after="0" w:line="270"/>
+            </w:pPr>
+            <w:r>
+              <w:rPr>
+                <w:rFonts w:ascii="Arial" w:cs="Arial" w:eastAsia="Microsoft JhengHei" w:hAnsi="Arial"/>
+                <w:b w:val="false"/>
+                <w:bCs w:val="false"/>
+                <w:sz w:val="19"/>
+                <w:szCs w:val="19"/>
+              </w:rPr>
+              <w:t xml:space="preserve">計程車兩台或一台廂型計程車進市區、入住</w:t>
             </w:r>
           </w:p>
         </w:tc>
@@ -13407,7 +13605,58 @@
           <w:sz w:val="19"/>
           <w:szCs w:val="19"/>
         </w:rPr>
-        <w:t xml:space="preserve">4/17 中午取車，4/21 下午還車計 5 天；只要 4/22 取車時刻前還車，都不會多算一天。</w:t>
+        <w:t xml:space="preserve">這天整條路線沿 A8 由西往東：Antibes（44 號出口）→ Saint-Paul → 尼斯機場，不走回頭路。</w:t>
+      </w:r>
+    </w:p>
+    <w:p>
+      <w:pPr>
+        <w:spacing w:after="60" w:line="280"/>
+        <w:ind w:left="200"/>
+      </w:pPr>
+      <w:r>
+        <w:rPr>
+          <w:rFonts w:ascii="Arial" w:cs="Arial" w:eastAsia="Microsoft JhengHei" w:hAnsi="Arial"/>
+          <w:b w:val="false"/>
+          <w:bCs w:val="false"/>
+          <w:color w:val="444444"/>
+          <w:sz w:val="19"/>
+          <w:szCs w:val="19"/>
+        </w:rPr>
+        <w:t xml:space="preserve">Antibes 排上午，是因為 Picasso 美術館中午 12:00–14:00 休息、市集只開到 13:00。</w:t>
+      </w:r>
+    </w:p>
+    <w:p>
+      <w:pPr>
+        <w:spacing w:after="60" w:line="280"/>
+        <w:ind w:left="200"/>
+      </w:pPr>
+      <w:r>
+        <w:rPr>
+          <w:rFonts w:ascii="Arial" w:cs="Arial" w:eastAsia="Microsoft JhengHei" w:hAnsi="Arial"/>
+          <w:b w:val="false"/>
+          <w:bCs w:val="false"/>
+          <w:color w:val="444444"/>
+          <w:sz w:val="19"/>
+          <w:szCs w:val="19"/>
+        </w:rPr>
+        <w:t xml:space="preserve">Maeght 改為選配：這天已有 Picasso，隔天還有 Matisse 與夏卡爾，美術館太密集。</w:t>
+      </w:r>
+    </w:p>
+    <w:p>
+      <w:pPr>
+        <w:spacing w:after="60" w:line="280"/>
+        <w:ind w:left="200"/>
+      </w:pPr>
+      <w:r>
+        <w:rPr>
+          <w:rFonts w:ascii="Arial" w:cs="Arial" w:eastAsia="Microsoft JhengHei" w:hAnsi="Arial"/>
+          <w:b w:val="false"/>
+          <w:bCs w:val="false"/>
+          <w:color w:val="444444"/>
+          <w:sz w:val="19"/>
+          <w:szCs w:val="19"/>
+        </w:rPr>
+        <w:t xml:space="preserve">4/17 中午取車，4/21 約 16:45 還車仍計 5 天；只要 4/22 取車時刻前還車，都不會多算一天。</w:t>
       </w:r>
     </w:p>
     <w:p>
@@ -15391,7 +15640,7 @@
         <w:rPr>
           <w:rFonts w:ascii="Arial" w:cs="Arial" w:eastAsia="Microsoft JhengHei" w:hAnsi="Arial"/>
         </w:rPr>
-        <w:t xml:space="preserve">4/24（六）摩納哥 ＋ Antibes</w:t>
+        <w:t xml:space="preserve">4/24（六）摩納哥 ＋ 芒通</w:t>
       </w:r>
     </w:p>
     <w:p>
@@ -15942,7 +16191,7 @@
                 <w:sz w:val="19"/>
                 <w:szCs w:val="19"/>
               </w:rPr>
-              <w:t xml:space="preserve">13:30–13:50</w:t>
+              <w:t xml:space="preserve">13:30–14:05</w:t>
             </w:r>
           </w:p>
         </w:tc>
@@ -15974,7 +16223,7 @@
                 <w:sz w:val="19"/>
                 <w:szCs w:val="19"/>
               </w:rPr>
-              <w:t xml:space="preserve">回摩納哥車站</w:t>
+              <w:t xml:space="preserve">回摩納哥車站，TER 至芒通（約 12–15 分）</w:t>
             </w:r>
           </w:p>
         </w:tc>
@@ -16011,7 +16260,7 @@
                 <w:sz w:val="19"/>
                 <w:szCs w:val="19"/>
               </w:rPr>
-              <w:t xml:space="preserve">約 14:00–14:50</w:t>
+              <w:t xml:space="preserve">14:10–17:30</w:t>
             </w:r>
           </w:p>
         </w:tc>
@@ -16053,17 +16302,17 @@
                 <w:sz w:val="19"/>
                 <w:szCs w:val="19"/>
               </w:rPr>
-              <w:t xml:space="preserve">TER 沿海線直達 Antibes</w:t>
-            </w:r>
-            <w:r>
-              <w:rPr>
-                <w:rFonts w:ascii="Arial" w:cs="Arial" w:eastAsia="Microsoft JhengHei" w:hAnsi="Arial"/>
-                <w:b w:val="false"/>
-                <w:bCs w:val="false"/>
-                <w:sz w:val="19"/>
-                <w:szCs w:val="19"/>
-              </w:rPr>
-              <w:t xml:space="preserve">（不用換車，約 50 分；班距約 1 小時，前一晚查好）</w:t>
+              <w:t xml:space="preserve">芒通</w:t>
+            </w:r>
+            <w:r>
+              <w:rPr>
+                <w:rFonts w:ascii="Arial" w:cs="Arial" w:eastAsia="Microsoft JhengHei" w:hAnsi="Arial"/>
+                <w:b w:val="false"/>
+                <w:bCs w:val="false"/>
+                <w:sz w:val="19"/>
+                <w:szCs w:val="19"/>
+              </w:rPr>
+              <w:t xml:space="preserve">：Rue Longue 舊城 → 聖米歇爾大教堂（中午休息，下午再開）→ 舊港與海濱</w:t>
             </w:r>
           </w:p>
         </w:tc>
@@ -16100,7 +16349,7 @@
                 <w:sz w:val="19"/>
                 <w:szCs w:val="19"/>
               </w:rPr>
-              <w:t xml:space="preserve">15:00–16:30</w:t>
+              <w:t xml:space="preserve">17:30–18:15</w:t>
             </w:r>
           </w:p>
         </w:tc>
@@ -16132,27 +16381,7 @@
                 <w:sz w:val="19"/>
                 <w:szCs w:val="19"/>
               </w:rPr>
-              <w:t xml:space="preserve"/>
-            </w:r>
-            <w:r>
-              <w:rPr>
-                <w:rFonts w:ascii="Arial" w:cs="Arial" w:eastAsia="Microsoft JhengHei" w:hAnsi="Arial"/>
-                <w:b/>
-                <w:bCs/>
-                <w:sz w:val="19"/>
-                <w:szCs w:val="19"/>
-              </w:rPr>
-              <w:t xml:space="preserve">Musée Picasso</w:t>
-            </w:r>
-            <w:r>
-              <w:rPr>
-                <w:rFonts w:ascii="Arial" w:cs="Arial" w:eastAsia="Microsoft JhengHei" w:hAnsi="Arial"/>
-                <w:b w:val="false"/>
-                <w:bCs w:val="false"/>
-                <w:sz w:val="19"/>
-                <w:szCs w:val="19"/>
-              </w:rPr>
-              <w:t xml:space="preserve">（Château Grimaldi；週一休；4 月 10:00–12:00、14:00–18:00，售票至 17:30；約 €6）</w:t>
+              <w:t xml:space="preserve">TER 回尼斯（前一晚存好兩班可接受的班次）</w:t>
             </w:r>
           </w:p>
         </w:tc>
@@ -16189,7 +16418,7 @@
                 <w:sz w:val="19"/>
                 <w:szCs w:val="19"/>
               </w:rPr>
-              <w:t xml:space="preserve">16:30–18:30</w:t>
+              <w:t xml:space="preserve">18:15–</w:t>
             </w:r>
           </w:p>
         </w:tc>
@@ -16221,145 +16450,7 @@
                 <w:sz w:val="19"/>
                 <w:szCs w:val="19"/>
               </w:rPr>
-              <w:t xml:space="preserve">老城、Vauban 城牆海濱步道、Port Vauban 遊艇港</w:t>
-            </w:r>
-          </w:p>
-        </w:tc>
-      </w:tr>
-      <w:tr>
-        <w:trPr>
-          <w:cantSplit/>
-        </w:trPr>
-        <w:tc>
-          <w:tcPr>
-            <w:tcW w:type="dxa" w:w="1700"/>
-            <w:tcBorders>
-              <w:top w:val="single" w:color="BFBFBF" w:sz="4"/>
-              <w:left w:val="single" w:color="BFBFBF" w:sz="4"/>
-              <w:bottom w:val="single" w:color="BFBFBF" w:sz="4"/>
-              <w:right w:val="single" w:color="BFBFBF" w:sz="4"/>
-            </w:tcBorders>
-            <w:tcMar>
-              <w:top w:type="dxa" w:w="60"/>
-              <w:left w:type="dxa" w:w="100"/>
-              <w:bottom w:type="dxa" w:w="60"/>
-              <w:right w:type="dxa" w:w="100"/>
-            </w:tcMar>
-          </w:tcPr>
-          <w:p>
-            <w:pPr>
-              <w:spacing w:after="0" w:line="270"/>
-            </w:pPr>
-            <w:r>
-              <w:rPr>
-                <w:rFonts w:ascii="Arial" w:cs="Arial" w:eastAsia="Microsoft JhengHei" w:hAnsi="Arial"/>
-                <w:b w:val="false"/>
-                <w:bCs w:val="false"/>
-                <w:sz w:val="19"/>
-                <w:szCs w:val="19"/>
-              </w:rPr>
-              <w:t xml:space="preserve">18:30–20:30</w:t>
-            </w:r>
-          </w:p>
-        </w:tc>
-        <w:tc>
-          <w:tcPr>
-            <w:tcW w:type="dxa" w:w="8206"/>
-            <w:tcBorders>
-              <w:top w:val="single" w:color="BFBFBF" w:sz="4"/>
-              <w:left w:val="single" w:color="BFBFBF" w:sz="4"/>
-              <w:bottom w:val="single" w:color="BFBFBF" w:sz="4"/>
-              <w:right w:val="single" w:color="BFBFBF" w:sz="4"/>
-            </w:tcBorders>
-            <w:tcMar>
-              <w:top w:type="dxa" w:w="60"/>
-              <w:left w:type="dxa" w:w="100"/>
-              <w:bottom w:type="dxa" w:w="60"/>
-              <w:right w:type="dxa" w:w="100"/>
-            </w:tcMar>
-          </w:tcPr>
-          <w:p>
-            <w:pPr>
-              <w:spacing w:after="0" w:line="270"/>
-            </w:pPr>
-            <w:r>
-              <w:rPr>
-                <w:rFonts w:ascii="Arial" w:cs="Arial" w:eastAsia="Microsoft JhengHei" w:hAnsi="Arial"/>
-                <w:b w:val="false"/>
-                <w:bCs w:val="false"/>
-                <w:sz w:val="19"/>
-                <w:szCs w:val="19"/>
-              </w:rPr>
-              <w:t xml:space="preserve">城牆上看日落 20:24 ＋ 老城晚餐</w:t>
-            </w:r>
-          </w:p>
-        </w:tc>
-      </w:tr>
-      <w:tr>
-        <w:trPr>
-          <w:cantSplit/>
-        </w:trPr>
-        <w:tc>
-          <w:tcPr>
-            <w:tcW w:type="dxa" w:w="1700"/>
-            <w:tcBorders>
-              <w:top w:val="single" w:color="BFBFBF" w:sz="4"/>
-              <w:left w:val="single" w:color="BFBFBF" w:sz="4"/>
-              <w:bottom w:val="single" w:color="BFBFBF" w:sz="4"/>
-              <w:right w:val="single" w:color="BFBFBF" w:sz="4"/>
-            </w:tcBorders>
-            <w:tcMar>
-              <w:top w:type="dxa" w:w="60"/>
-              <w:left w:type="dxa" w:w="100"/>
-              <w:bottom w:type="dxa" w:w="60"/>
-              <w:right w:type="dxa" w:w="100"/>
-            </w:tcMar>
-          </w:tcPr>
-          <w:p>
-            <w:pPr>
-              <w:spacing w:after="0" w:line="270"/>
-            </w:pPr>
-            <w:r>
-              <w:rPr>
-                <w:rFonts w:ascii="Arial" w:cs="Arial" w:eastAsia="Microsoft JhengHei" w:hAnsi="Arial"/>
-                <w:b w:val="false"/>
-                <w:bCs w:val="false"/>
-                <w:sz w:val="19"/>
-                <w:szCs w:val="19"/>
-              </w:rPr>
-              <w:t xml:space="preserve">約 20:45</w:t>
-            </w:r>
-          </w:p>
-        </w:tc>
-        <w:tc>
-          <w:tcPr>
-            <w:tcW w:type="dxa" w:w="8206"/>
-            <w:tcBorders>
-              <w:top w:val="single" w:color="BFBFBF" w:sz="4"/>
-              <w:left w:val="single" w:color="BFBFBF" w:sz="4"/>
-              <w:bottom w:val="single" w:color="BFBFBF" w:sz="4"/>
-              <w:right w:val="single" w:color="BFBFBF" w:sz="4"/>
-            </w:tcBorders>
-            <w:tcMar>
-              <w:top w:type="dxa" w:w="60"/>
-              <w:left w:type="dxa" w:w="100"/>
-              <w:bottom w:type="dxa" w:w="60"/>
-              <w:right w:type="dxa" w:w="100"/>
-            </w:tcMar>
-          </w:tcPr>
-          <w:p>
-            <w:pPr>
-              <w:spacing w:after="0" w:line="270"/>
-            </w:pPr>
-            <w:r>
-              <w:rPr>
-                <w:rFonts w:ascii="Arial" w:cs="Arial" w:eastAsia="Microsoft JhengHei" w:hAnsi="Arial"/>
-                <w:b w:val="false"/>
-                <w:bCs w:val="false"/>
-                <w:sz w:val="19"/>
-                <w:szCs w:val="19"/>
-              </w:rPr>
-              <w:t xml:space="preserve">TER 回尼斯（約 25 分）</w:t>
+              <w:t xml:space="preserve">尼斯自由活動、晚餐；日落 20:24</w:t>
             </w:r>
           </w:p>
         </w:tc>
@@ -16402,40 +16493,6 @@
           <w:szCs w:val="19"/>
         </w:rPr>
         <w:t xml:space="preserve">Monaco E-Prix 5/1–5/2，賭場周邊大概率在架設護欄，預期繞路。</w:t>
-      </w:r>
-    </w:p>
-    <w:p>
-      <w:pPr>
-        <w:spacing w:after="60" w:line="280"/>
-        <w:ind w:left="200"/>
-      </w:pPr>
-      <w:r>
-        <w:rPr>
-          <w:rFonts w:ascii="Arial" w:cs="Arial" w:eastAsia="Microsoft JhengHei" w:hAnsi="Arial"/>
-          <w:b w:val="false"/>
-          <w:bCs w:val="false"/>
-          <w:color w:val="444444"/>
-          <w:sz w:val="19"/>
-          <w:szCs w:val="19"/>
-        </w:rPr>
-        <w:t xml:space="preserve">Antibes 的普羅旺斯市集只有上午，這次趕不上。</w:t>
-      </w:r>
-    </w:p>
-    <w:p>
-      <w:pPr>
-        <w:spacing w:after="60" w:line="280"/>
-        <w:ind w:left="200"/>
-      </w:pPr>
-      <w:r>
-        <w:rPr>
-          <w:rFonts w:ascii="Arial" w:cs="Arial" w:eastAsia="Microsoft JhengHei" w:hAnsi="Arial"/>
-          <w:b w:val="false"/>
-          <w:bCs w:val="false"/>
-          <w:color w:val="444444"/>
-          <w:sz w:val="19"/>
-          <w:szCs w:val="19"/>
-        </w:rPr>
-        <w:t xml:space="preserve">為什麼用 Antibes 取代芒通：芒通是原行程最弱的一段；Antibes 有 Picasso 美術館、城牆老城和遊艇港，而且從摩納哥搭同一條線就能直達。</w:t>
       </w:r>
     </w:p>
     <w:p>
@@ -19583,7 +19640,7 @@
           <w:b w:val="false"/>
           <w:bCs w:val="false"/>
         </w:rPr>
-        <w:t xml:space="preserve">還車：4/21 約 15:30，NCE T2；計 5 天。訂車時問清楚甲租乙還的費用。</w:t>
+        <w:t xml:space="preserve">還車：4/21 約 16:45，NCE T2；計 5 天。訂車時問清楚甲租乙還的費用。</w:t>
       </w:r>
     </w:p>
     <w:p>
@@ -21156,6 +21213,139 @@
                 <w:sz w:val="19"/>
                 <w:szCs w:val="19"/>
               </w:rPr>
+              <w:t xml:space="preserve">Antibes</w:t>
+            </w:r>
+          </w:p>
+        </w:tc>
+        <w:tc>
+          <w:tcPr>
+            <w:tcW w:type="dxa" w:w="1200"/>
+            <w:tcBorders>
+              <w:top w:val="single" w:color="BFBFBF" w:sz="4"/>
+              <w:left w:val="single" w:color="BFBFBF" w:sz="4"/>
+              <w:bottom w:val="single" w:color="BFBFBF" w:sz="4"/>
+              <w:right w:val="single" w:color="BFBFBF" w:sz="4"/>
+            </w:tcBorders>
+            <w:tcMar>
+              <w:top w:type="dxa" w:w="60"/>
+              <w:left w:type="dxa" w:w="100"/>
+              <w:bottom w:type="dxa" w:w="60"/>
+              <w:right w:type="dxa" w:w="100"/>
+            </w:tcMar>
+          </w:tcPr>
+          <w:p>
+            <w:pPr>
+              <w:spacing w:after="0" w:line="270"/>
+            </w:pPr>
+            <w:r>
+              <w:rPr>
+                <w:rFonts w:ascii="Arial" w:cs="Arial" w:eastAsia="Microsoft JhengHei" w:hAnsi="Arial"/>
+                <w:b w:val="false"/>
+                <w:bCs w:val="false"/>
+                <w:sz w:val="19"/>
+                <w:szCs w:val="19"/>
+              </w:rPr>
+              <w:t xml:space="preserve">4/21</w:t>
+            </w:r>
+          </w:p>
+        </w:tc>
+        <w:tc>
+          <w:tcPr>
+            <w:tcW w:type="dxa" w:w="1500"/>
+            <w:tcBorders>
+              <w:top w:val="single" w:color="BFBFBF" w:sz="4"/>
+              <w:left w:val="single" w:color="BFBFBF" w:sz="4"/>
+              <w:bottom w:val="single" w:color="BFBFBF" w:sz="4"/>
+              <w:right w:val="single" w:color="BFBFBF" w:sz="4"/>
+            </w:tcBorders>
+            <w:tcMar>
+              <w:top w:type="dxa" w:w="60"/>
+              <w:left w:type="dxa" w:w="100"/>
+              <w:bottom w:type="dxa" w:w="60"/>
+              <w:right w:type="dxa" w:w="100"/>
+            </w:tcMar>
+          </w:tcPr>
+          <w:p>
+            <w:pPr>
+              <w:spacing w:after="0" w:line="270"/>
+            </w:pPr>
+            <w:r>
+              <w:rPr>
+                <w:rFonts w:ascii="Arial" w:cs="Arial" w:eastAsia="Microsoft JhengHei" w:hAnsi="Arial"/>
+                <w:b w:val="false"/>
+                <w:bCs w:val="false"/>
+                <w:sz w:val="19"/>
+                <w:szCs w:val="19"/>
+              </w:rPr>
+              <w:t xml:space="preserve">是</w:t>
+            </w:r>
+          </w:p>
+        </w:tc>
+        <w:tc>
+          <w:tcPr>
+            <w:tcW w:type="dxa" w:w="5106"/>
+            <w:tcBorders>
+              <w:top w:val="single" w:color="BFBFBF" w:sz="4"/>
+              <w:left w:val="single" w:color="BFBFBF" w:sz="4"/>
+              <w:bottom w:val="single" w:color="BFBFBF" w:sz="4"/>
+              <w:right w:val="single" w:color="BFBFBF" w:sz="4"/>
+            </w:tcBorders>
+            <w:tcMar>
+              <w:top w:type="dxa" w:w="60"/>
+              <w:left w:type="dxa" w:w="100"/>
+              <w:bottom w:type="dxa" w:w="60"/>
+              <w:right w:type="dxa" w:w="100"/>
+            </w:tcMar>
+          </w:tcPr>
+          <w:p>
+            <w:pPr>
+              <w:spacing w:after="0" w:line="270"/>
+            </w:pPr>
+            <w:r>
+              <w:rPr>
+                <w:rFonts w:ascii="Arial" w:cs="Arial" w:eastAsia="Microsoft JhengHei" w:hAnsi="Arial"/>
+                <w:b w:val="false"/>
+                <w:bCs w:val="false"/>
+                <w:sz w:val="19"/>
+                <w:szCs w:val="19"/>
+              </w:rPr>
+              <w:t xml:space="preserve">Q-Park Pré-aux-Pêcheurs 地下停車場（港邊；⚠ 確認限高）</w:t>
+            </w:r>
+          </w:p>
+        </w:tc>
+      </w:tr>
+      <w:tr>
+        <w:trPr>
+          <w:cantSplit/>
+        </w:trPr>
+        <w:tc>
+          <w:tcPr>
+            <w:tcW w:type="dxa" w:w="2100"/>
+            <w:tcBorders>
+              <w:top w:val="single" w:color="BFBFBF" w:sz="4"/>
+              <w:left w:val="single" w:color="BFBFBF" w:sz="4"/>
+              <w:bottom w:val="single" w:color="BFBFBF" w:sz="4"/>
+              <w:right w:val="single" w:color="BFBFBF" w:sz="4"/>
+            </w:tcBorders>
+            <w:tcMar>
+              <w:top w:type="dxa" w:w="60"/>
+              <w:left w:type="dxa" w:w="100"/>
+              <w:bottom w:type="dxa" w:w="60"/>
+              <w:right w:type="dxa" w:w="100"/>
+            </w:tcMar>
+          </w:tcPr>
+          <w:p>
+            <w:pPr>
+              <w:spacing w:after="0" w:line="270"/>
+            </w:pPr>
+            <w:r>
+              <w:rPr>
+                <w:rFonts w:ascii="Arial" w:cs="Arial" w:eastAsia="Microsoft JhengHei" w:hAnsi="Arial"/>
+                <w:b w:val="false"/>
+                <w:bCs w:val="false"/>
+                <w:sz w:val="19"/>
+                <w:szCs w:val="19"/>
+              </w:rPr>
               <w:t xml:space="preserve">Saint-Paul-de-Vence</w:t>
             </w:r>
           </w:p>
@@ -24967,139 +25157,6 @@
                 <w:szCs w:val="19"/>
               </w:rPr>
               <w:t xml:space="preserve">現在</w:t>
-            </w:r>
-          </w:p>
-        </w:tc>
-        <w:tc>
-          <w:tcPr>
-            <w:tcW w:type="dxa" w:w="2806"/>
-            <w:tcBorders>
-              <w:top w:val="single" w:color="BFBFBF" w:sz="4"/>
-              <w:left w:val="single" w:color="BFBFBF" w:sz="4"/>
-              <w:bottom w:val="single" w:color="BFBFBF" w:sz="4"/>
-              <w:right w:val="single" w:color="BFBFBF" w:sz="4"/>
-            </w:tcBorders>
-            <w:tcMar>
-              <w:top w:type="dxa" w:w="60"/>
-              <w:left w:type="dxa" w:w="100"/>
-              <w:bottom w:type="dxa" w:w="60"/>
-              <w:right w:type="dxa" w:w="100"/>
-            </w:tcMar>
-          </w:tcPr>
-          <w:p>
-            <w:pPr>
-              <w:spacing w:after="0" w:line="270"/>
-            </w:pPr>
-            <w:r>
-              <w:rPr>
-                <w:rFonts w:ascii="Arial" w:cs="Arial" w:eastAsia="Microsoft JhengHei" w:hAnsi="Arial"/>
-                <w:b w:val="false"/>
-                <w:bCs w:val="false"/>
-                <w:sz w:val="19"/>
-                <w:szCs w:val="19"/>
-              </w:rPr>
-              <w:t xml:space="preserve"/>
-            </w:r>
-          </w:p>
-        </w:tc>
-      </w:tr>
-      <w:tr>
-        <w:trPr>
-          <w:cantSplit/>
-        </w:trPr>
-        <w:tc>
-          <w:tcPr>
-            <w:tcW w:type="dxa" w:w="3300"/>
-            <w:tcBorders>
-              <w:top w:val="single" w:color="BFBFBF" w:sz="4"/>
-              <w:left w:val="single" w:color="BFBFBF" w:sz="4"/>
-              <w:bottom w:val="single" w:color="BFBFBF" w:sz="4"/>
-              <w:right w:val="single" w:color="BFBFBF" w:sz="4"/>
-            </w:tcBorders>
-            <w:tcMar>
-              <w:top w:type="dxa" w:w="60"/>
-              <w:left w:type="dxa" w:w="100"/>
-              <w:bottom w:type="dxa" w:w="60"/>
-              <w:right w:type="dxa" w:w="100"/>
-            </w:tcMar>
-          </w:tcPr>
-          <w:p>
-            <w:pPr>
-              <w:spacing w:after="0" w:line="270"/>
-            </w:pPr>
-            <w:r>
-              <w:rPr>
-                <w:rFonts w:ascii="Arial" w:cs="Arial" w:eastAsia="Microsoft JhengHei" w:hAnsi="Arial"/>
-                <w:b w:val="false"/>
-                <w:bCs w:val="false"/>
-                <w:sz w:val="19"/>
-                <w:szCs w:val="19"/>
-              </w:rPr>
-              <w:t xml:space="preserve">La Colombe d'Or 午餐（選配）</w:t>
-            </w:r>
-          </w:p>
-        </w:tc>
-        <w:tc>
-          <w:tcPr>
-            <w:tcW w:type="dxa" w:w="1700"/>
-            <w:tcBorders>
-              <w:top w:val="single" w:color="BFBFBF" w:sz="4"/>
-              <w:left w:val="single" w:color="BFBFBF" w:sz="4"/>
-              <w:bottom w:val="single" w:color="BFBFBF" w:sz="4"/>
-              <w:right w:val="single" w:color="BFBFBF" w:sz="4"/>
-            </w:tcBorders>
-            <w:tcMar>
-              <w:top w:type="dxa" w:w="60"/>
-              <w:left w:type="dxa" w:w="100"/>
-              <w:bottom w:type="dxa" w:w="60"/>
-              <w:right w:type="dxa" w:w="100"/>
-            </w:tcMar>
-          </w:tcPr>
-          <w:p>
-            <w:pPr>
-              <w:spacing w:after="0" w:line="270"/>
-            </w:pPr>
-            <w:r>
-              <w:rPr>
-                <w:rFonts w:ascii="Arial" w:cs="Arial" w:eastAsia="Microsoft JhengHei" w:hAnsi="Arial"/>
-                <w:b w:val="false"/>
-                <w:bCs w:val="false"/>
-                <w:sz w:val="19"/>
-                <w:szCs w:val="19"/>
-              </w:rPr>
-              <w:t xml:space="preserve">4/21</w:t>
-            </w:r>
-          </w:p>
-        </w:tc>
-        <w:tc>
-          <w:tcPr>
-            <w:tcW w:type="dxa" w:w="2100"/>
-            <w:tcBorders>
-              <w:top w:val="single" w:color="BFBFBF" w:sz="4"/>
-              <w:left w:val="single" w:color="BFBFBF" w:sz="4"/>
-              <w:bottom w:val="single" w:color="BFBFBF" w:sz="4"/>
-              <w:right w:val="single" w:color="BFBFBF" w:sz="4"/>
-            </w:tcBorders>
-            <w:tcMar>
-              <w:top w:type="dxa" w:w="60"/>
-              <w:left w:type="dxa" w:w="100"/>
-              <w:bottom w:type="dxa" w:w="60"/>
-              <w:right w:type="dxa" w:w="100"/>
-            </w:tcMar>
-          </w:tcPr>
-          <w:p>
-            <w:pPr>
-              <w:spacing w:after="0" w:line="270"/>
-            </w:pPr>
-            <w:r>
-              <w:rPr>
-                <w:rFonts w:ascii="Arial" w:cs="Arial" w:eastAsia="Microsoft JhengHei" w:hAnsi="Arial"/>
-                <w:b w:val="false"/>
-                <w:bCs w:val="false"/>
-                <w:sz w:val="19"/>
-                <w:szCs w:val="19"/>
-              </w:rPr>
-              <w:t xml:space="preserve">數月前</w:t>
             </w:r>
           </w:p>
         </w:tc>
@@ -26410,24 +26467,6 @@
           <w:bCs w:val="false"/>
         </w:rPr>
         <w:t xml:space="preserve">重查：LUMA 四月開放日、4/25 國立博物館免費、Carrières 2027 檔期、五漁村卡價位、愛之路預約開放日、賭場上午參觀時間、Galata 週一開放。</w:t>
-      </w:r>
-    </w:p>
-    <w:p>
-      <w:pPr>
-        <w:pStyle w:val="ListParagraph"/>
-        <w:numPr>
-          <w:ilvl w:val="0"/>
-          <w:numId w:val="2"/>
-        </w:numPr>
-        <w:spacing w:after="40" w:line="290"/>
-      </w:pPr>
-      <w:r>
-        <w:rPr>
-          <w:rFonts w:ascii="Arial" w:cs="Arial" w:eastAsia="Microsoft JhengHei" w:hAnsi="Arial"/>
-          <w:b w:val="false"/>
-          <w:bCs w:val="false"/>
-        </w:rPr>
-        <w:t xml:space="preserve">訂 La Colombe d'Or（若要去）。</w:t>
       </w:r>
     </w:p>
     <w:p>
@@ -27188,7 +27227,7 @@
                 <w:sz w:val="19"/>
                 <w:szCs w:val="19"/>
               </w:rPr>
-              <w:t xml:space="preserve">4/22、4/23 下雨</w:t>
+              <w:t xml:space="preserve">4/21 下雨</w:t>
             </w:r>
           </w:p>
         </w:tc>
@@ -27220,7 +27259,7 @@
                 <w:sz w:val="19"/>
                 <w:szCs w:val="19"/>
               </w:rPr>
-              <w:t xml:space="preserve">尼斯美術館（MAMAC、Masséna、Palais Lascaris）</w:t>
+              <w:t xml:space="preserve">Antibes 只看 Picasso 美術館與有頂市集，Saint-Paul 縮短</w:t>
             </w:r>
           </w:p>
         </w:tc>
@@ -27257,6 +27296,75 @@
                 <w:sz w:val="19"/>
                 <w:szCs w:val="19"/>
               </w:rPr>
+              <w:t xml:space="preserve">4/22、4/23 下雨</w:t>
+            </w:r>
+          </w:p>
+        </w:tc>
+        <w:tc>
+          <w:tcPr>
+            <w:tcW w:type="dxa" w:w="6606"/>
+            <w:tcBorders>
+              <w:top w:val="single" w:color="BFBFBF" w:sz="4"/>
+              <w:left w:val="single" w:color="BFBFBF" w:sz="4"/>
+              <w:bottom w:val="single" w:color="BFBFBF" w:sz="4"/>
+              <w:right w:val="single" w:color="BFBFBF" w:sz="4"/>
+            </w:tcBorders>
+            <w:tcMar>
+              <w:top w:type="dxa" w:w="60"/>
+              <w:left w:type="dxa" w:w="100"/>
+              <w:bottom w:type="dxa" w:w="60"/>
+              <w:right w:type="dxa" w:w="100"/>
+            </w:tcMar>
+          </w:tcPr>
+          <w:p>
+            <w:pPr>
+              <w:spacing w:after="0" w:line="270"/>
+            </w:pPr>
+            <w:r>
+              <w:rPr>
+                <w:rFonts w:ascii="Arial" w:cs="Arial" w:eastAsia="Microsoft JhengHei" w:hAnsi="Arial"/>
+                <w:b w:val="false"/>
+                <w:bCs w:val="false"/>
+                <w:sz w:val="19"/>
+                <w:szCs w:val="19"/>
+              </w:rPr>
+              <w:t xml:space="preserve">尼斯美術館（MAMAC、Masséna、Palais Lascaris）</w:t>
+            </w:r>
+          </w:p>
+        </w:tc>
+      </w:tr>
+      <w:tr>
+        <w:trPr>
+          <w:cantSplit/>
+        </w:trPr>
+        <w:tc>
+          <w:tcPr>
+            <w:tcW w:type="dxa" w:w="3300"/>
+            <w:tcBorders>
+              <w:top w:val="single" w:color="BFBFBF" w:sz="4"/>
+              <w:left w:val="single" w:color="BFBFBF" w:sz="4"/>
+              <w:bottom w:val="single" w:color="BFBFBF" w:sz="4"/>
+              <w:right w:val="single" w:color="BFBFBF" w:sz="4"/>
+            </w:tcBorders>
+            <w:tcMar>
+              <w:top w:type="dxa" w:w="60"/>
+              <w:left w:type="dxa" w:w="100"/>
+              <w:bottom w:type="dxa" w:w="60"/>
+              <w:right w:type="dxa" w:w="100"/>
+            </w:tcMar>
+          </w:tcPr>
+          <w:p>
+            <w:pPr>
+              <w:spacing w:after="0" w:line="270"/>
+            </w:pPr>
+            <w:r>
+              <w:rPr>
+                <w:rFonts w:ascii="Arial" w:cs="Arial" w:eastAsia="Microsoft JhengHei" w:hAnsi="Arial"/>
+                <w:b w:val="false"/>
+                <w:bCs w:val="false"/>
+                <w:sz w:val="19"/>
+                <w:szCs w:val="19"/>
+              </w:rPr>
               <w:t xml:space="preserve">4/24 下雨</w:t>
             </w:r>
           </w:p>
@@ -27289,7 +27397,7 @@
                 <w:sz w:val="19"/>
                 <w:szCs w:val="19"/>
               </w:rPr>
-              <w:t xml:space="preserve">摩納哥海洋博物館（4 月每天 10:00–19:00），Antibes 只看 Picasso 美術館</w:t>
+              <w:t xml:space="preserve">摩納哥海洋博物館（4 月每天 10:00–19:00），放棄芒通</w:t>
             </w:r>
           </w:p>
         </w:tc>
@@ -28343,6 +28451,107 @@
                 <w:szCs w:val="19"/>
               </w:rPr>
               <w:t xml:space="preserve">只去水族館 ＋ Boccadasse</w:t>
+            </w:r>
+          </w:p>
+        </w:tc>
+      </w:tr>
+      <w:tr>
+        <w:trPr>
+          <w:cantSplit/>
+        </w:trPr>
+        <w:tc>
+          <w:tcPr>
+            <w:tcW w:type="dxa" w:w="3600"/>
+            <w:tcBorders>
+              <w:top w:val="single" w:color="BFBFBF" w:sz="4"/>
+              <w:left w:val="single" w:color="BFBFBF" w:sz="4"/>
+              <w:bottom w:val="single" w:color="BFBFBF" w:sz="4"/>
+              <w:right w:val="single" w:color="BFBFBF" w:sz="4"/>
+            </w:tcBorders>
+            <w:tcMar>
+              <w:top w:type="dxa" w:w="60"/>
+              <w:left w:type="dxa" w:w="100"/>
+              <w:bottom w:type="dxa" w:w="60"/>
+              <w:right w:type="dxa" w:w="100"/>
+            </w:tcMar>
+          </w:tcPr>
+          <w:p>
+            <w:pPr>
+              <w:spacing w:after="0" w:line="270"/>
+            </w:pPr>
+            <w:r>
+              <w:rPr>
+                <w:rFonts w:ascii="Arial" w:cs="Arial" w:eastAsia="Microsoft JhengHei" w:hAnsi="Arial"/>
+                <w:b w:val="false"/>
+                <w:bCs w:val="false"/>
+                <w:sz w:val="19"/>
+                <w:szCs w:val="19"/>
+              </w:rPr>
+              <w:t xml:space="preserve">Antibes Q-Park 地下停車場限高</w:t>
+            </w:r>
+          </w:p>
+        </w:tc>
+        <w:tc>
+          <w:tcPr>
+            <w:tcW w:type="dxa" w:w="2000"/>
+            <w:tcBorders>
+              <w:top w:val="single" w:color="BFBFBF" w:sz="4"/>
+              <w:left w:val="single" w:color="BFBFBF" w:sz="4"/>
+              <w:bottom w:val="single" w:color="BFBFBF" w:sz="4"/>
+              <w:right w:val="single" w:color="BFBFBF" w:sz="4"/>
+            </w:tcBorders>
+            <w:tcMar>
+              <w:top w:type="dxa" w:w="60"/>
+              <w:left w:type="dxa" w:w="100"/>
+              <w:bottom w:type="dxa" w:w="60"/>
+              <w:right w:type="dxa" w:w="100"/>
+            </w:tcMar>
+          </w:tcPr>
+          <w:p>
+            <w:pPr>
+              <w:spacing w:after="0" w:line="270"/>
+            </w:pPr>
+            <w:r>
+              <w:rPr>
+                <w:rFonts w:ascii="Arial" w:cs="Arial" w:eastAsia="Microsoft JhengHei" w:hAnsi="Arial"/>
+                <w:b w:val="false"/>
+                <w:bCs w:val="false"/>
+                <w:sz w:val="19"/>
+                <w:szCs w:val="19"/>
+              </w:rPr>
+              <w:t xml:space="preserve">4/21 停車</w:t>
+            </w:r>
+          </w:p>
+        </w:tc>
+        <w:tc>
+          <w:tcPr>
+            <w:tcW w:type="dxa" w:w="4306"/>
+            <w:tcBorders>
+              <w:top w:val="single" w:color="BFBFBF" w:sz="4"/>
+              <w:left w:val="single" w:color="BFBFBF" w:sz="4"/>
+              <w:bottom w:val="single" w:color="BFBFBF" w:sz="4"/>
+              <w:right w:val="single" w:color="BFBFBF" w:sz="4"/>
+            </w:tcBorders>
+            <w:tcMar>
+              <w:top w:type="dxa" w:w="60"/>
+              <w:left w:type="dxa" w:w="100"/>
+              <w:bottom w:type="dxa" w:w="60"/>
+              <w:right w:type="dxa" w:w="100"/>
+            </w:tcMar>
+          </w:tcPr>
+          <w:p>
+            <w:pPr>
+              <w:spacing w:after="0" w:line="270"/>
+            </w:pPr>
+            <w:r>
+              <w:rPr>
+                <w:rFonts w:ascii="Arial" w:cs="Arial" w:eastAsia="Microsoft JhengHei" w:hAnsi="Arial"/>
+                <w:b w:val="false"/>
+                <w:bCs w:val="false"/>
+                <w:sz w:val="19"/>
+                <w:szCs w:val="19"/>
+              </w:rPr>
+              <w:t xml:space="preserve">改停 Antibes 其他地下停車場</w:t>
             </w:r>
           </w:p>
         </w:tc>
@@ -28559,7 +28768,7 @@
           <w:b w:val="false"/>
           <w:bCs w:val="false"/>
         </w:rPr>
-        <w:t xml:space="preserve">Picasso Antibes：antibesjuanlespins.com</w:t>
+        <w:t xml:space="preserve">Picasso Antibes：antibesjuanlespins.com；Antibes 市集：seeantibes.com；Q-Park：q-park.fr</w:t>
       </w:r>
     </w:p>
     <w:p>

</xml_diff>